<commit_message>
fix(courseware): C11 is a ONE-day course, not two
The storefront lists C11 at 1 day / $350; the WSQ parent is 2 days. The
conversion inherited the 2-day structure.

- LP: single 9:30am-5:30pm schedule table covering all 5 topics with
  Labs 1, 3, 5, 7 and 9; Day 2 table, heading and TOC entry removed
- Deck slide 7: 'Course Outline — 2 Days' -> '1 Day', Day 1/Day 2 cards
  rebuilt as Morning/Afternoon
- Overview and README: 'two-day' -> 'one-day'

QA: scan_prohibited.py PASS (45 artifacts).

Co-Authored-By: Claude Opus 5 <noreply@anthropic.com>
</commit_message>
<xml_diff>
--- a/courseware/LP-Generative AI for SEO.docx
+++ b/courseware/LP-Generative AI for SEO.docx
@@ -548,27 +548,7 @@
           <w:color w:val="333333"/>
           <w:sz w:val="21"/>
         </w:rPr>
-        <w:t>Day 1</w:t>
-        <w:tab/>
-        <w:t>4</w:t>
-      </w:r>
-    </w:p>
-    <w:p>
-      <w:pPr>
-        <w:tabs>
-          <w:tab w:pos="9072" w:val="right" w:leader="dot"/>
-        </w:tabs>
-        <w:spacing w:after="60"/>
-        <w:ind w:left="432"/>
-      </w:pPr>
-      <w:r>
-        <w:rPr>
-          <w:rFonts w:ascii="Arial" w:hAnsi="Arial"/>
-          <w:b w:val="0"/>
-          <w:color w:val="333333"/>
-          <w:sz w:val="21"/>
-        </w:rPr>
-        <w:t>Day 2</w:t>
+        <w:t>Course Day</w:t>
         <w:tab/>
         <w:t>4</w:t>
       </w:r>
@@ -726,7 +706,7 @@
     </w:p>
     <w:p>
       <w:r>
-        <w:t>A two-day applied course on using generative AI, structured prompts and governed workflows to research, create, optimise, distribute and measure SEO content across classic and generative search experiences.</w:t>
+        <w:t>A one-day applied course on using generative AI, structured prompts and governed workflows to research, create, optimise, distribute and measure SEO content across classic and generative search experiences.</w:t>
       </w:r>
     </w:p>
     <w:p>
@@ -790,7 +770,7 @@
         <w:pStyle w:val="Heading2"/>
       </w:pPr>
       <w:r>
-        <w:t>Day 1</w:t>
+        <w:t>Course Day</w:t>
       </w:r>
     </w:p>
     <w:tbl>
@@ -905,7 +885,7 @@
           </w:tcPr>
           <w:p>
             <w:r>
-              <w:t>—</w:t>
+              <w:t>Slides 1–15</w:t>
             </w:r>
           </w:p>
         </w:tc>
@@ -917,7 +897,7 @@
           </w:tcPr>
           <w:p>
             <w:r>
-              <w:t>10:00 AM–11:30 AM</w:t>
+              <w:t>10:00 AM–11:15 AM</w:t>
             </w:r>
           </w:p>
         </w:tc>
@@ -927,7 +907,7 @@
           </w:tcPr>
           <w:p>
             <w:r>
-              <w:t>90 min</w:t>
+              <w:t>75 min</w:t>
             </w:r>
           </w:p>
         </w:tc>
@@ -937,7 +917,7 @@
           </w:tcPr>
           <w:p>
             <w:r>
-              <w:t>Topic 1 — Fundamentals of SEO and Generative AI</w:t>
+              <w:t>Topic 1 — Fundamentals of SEO and Generative AI + Lab 1</w:t>
             </w:r>
           </w:p>
         </w:tc>
@@ -969,7 +949,7 @@
           </w:tcPr>
           <w:p>
             <w:r>
-              <w:t>11:30 AM–11:40 AM</w:t>
+              <w:t>11:15 AM–11:25 AM</w:t>
             </w:r>
           </w:p>
         </w:tc>
@@ -1021,7 +1001,7 @@
           </w:tcPr>
           <w:p>
             <w:r>
-              <w:t>11:40 AM–12:30 PM</w:t>
+              <w:t>11:25 AM–12:30 PM</w:t>
             </w:r>
           </w:p>
         </w:tc>
@@ -1031,7 +1011,7 @@
           </w:tcPr>
           <w:p>
             <w:r>
-              <w:t>50 min</w:t>
+              <w:t>65 min</w:t>
             </w:r>
           </w:p>
         </w:tc>
@@ -1041,7 +1021,7 @@
           </w:tcPr>
           <w:p>
             <w:r>
-              <w:t>Labs 1–2 — baseline audit and AI SEO strategy</w:t>
+              <w:t>Topic 2 — AI-powered keyword research and content strategy + Lab 3</w:t>
             </w:r>
           </w:p>
         </w:tc>
@@ -1061,7 +1041,7 @@
           </w:tcPr>
           <w:p>
             <w:r>
-              <w:t>L1: 30, L2: 34</w:t>
+              <w:t>Slides 40–63</w:t>
             </w:r>
           </w:p>
         </w:tc>
@@ -1125,7 +1105,7 @@
           </w:tcPr>
           <w:p>
             <w:r>
-              <w:t>1:30 PM–3:00 PM</w:t>
+              <w:t>1:30 PM–2:45 PM</w:t>
             </w:r>
           </w:p>
         </w:tc>
@@ -1135,7 +1115,7 @@
           </w:tcPr>
           <w:p>
             <w:r>
-              <w:t>90 min</w:t>
+              <w:t>75 min</w:t>
             </w:r>
           </w:p>
         </w:tc>
@@ -1145,7 +1125,7 @@
           </w:tcPr>
           <w:p>
             <w:r>
-              <w:t>Topic 2 — AI-powered keyword research and content strategy</w:t>
+              <w:t>Topic 3 — SEO content, images, video and social + Lab 5</w:t>
             </w:r>
           </w:p>
         </w:tc>
@@ -1165,7 +1145,7 @@
           </w:tcPr>
           <w:p>
             <w:r>
-              <w:t>Slides 40–63</w:t>
+              <w:t>Slides 64–87</w:t>
             </w:r>
           </w:p>
         </w:tc>
@@ -1177,7 +1157,7 @@
           </w:tcPr>
           <w:p>
             <w:r>
-              <w:t>3:00 PM–3:10 PM</w:t>
+              <w:t>2:45 PM–2:55 PM</w:t>
             </w:r>
           </w:p>
         </w:tc>
@@ -1229,7 +1209,7 @@
           </w:tcPr>
           <w:p>
             <w:r>
-              <w:t>3:10 PM–4:40 PM</w:t>
+              <w:t>2:55 PM–4:00 PM</w:t>
             </w:r>
           </w:p>
         </w:tc>
@@ -1239,7 +1219,7 @@
           </w:tcPr>
           <w:p>
             <w:r>
-              <w:t>90 min</w:t>
+              <w:t>65 min</w:t>
             </w:r>
           </w:p>
         </w:tc>
@@ -1249,7 +1229,7 @@
           </w:tcPr>
           <w:p>
             <w:r>
-              <w:t>Labs 3–4 — keywords, clusters and content briefs</w:t>
+              <w:t>Topic 4 — On-page SEO and Google AI Overviews + Lab 7</w:t>
             </w:r>
           </w:p>
         </w:tc>
@@ -1269,7 +1249,7 @@
           </w:tcPr>
           <w:p>
             <w:r>
-              <w:t>L3: 55, L4: 59</w:t>
+              <w:t>Slides 88–111</w:t>
             </w:r>
           </w:p>
         </w:tc>
@@ -1281,7 +1261,7 @@
           </w:tcPr>
           <w:p>
             <w:r>
-              <w:t>4:40 PM–4:50 PM</w:t>
+              <w:t>4:00 PM–4:10 PM</w:t>
             </w:r>
           </w:p>
         </w:tc>
@@ -1333,289 +1313,7 @@
           </w:tcPr>
           <w:p>
             <w:r>
-              <w:t>4:50 PM–5:30 PM</w:t>
-            </w:r>
-          </w:p>
-        </w:tc>
-        <w:tc>
-          <w:tcPr>
-            <w:tcW w:type="dxa" w:w="1999"/>
-          </w:tcPr>
-          <w:p>
-            <w:r>
-              <w:t>40 min</w:t>
-            </w:r>
-          </w:p>
-        </w:tc>
-        <w:tc>
-          <w:tcPr>
-            <w:tcW w:type="dxa" w:w="1999"/>
-          </w:tcPr>
-          <w:p>
-            <w:r>
-              <w:t>Topic 3 foundation — AI content, images and video</w:t>
-            </w:r>
-          </w:p>
-        </w:tc>
-        <w:tc>
-          <w:tcPr>
-            <w:tcW w:type="dxa" w:w="1999"/>
-          </w:tcPr>
-          <w:p>
-            <w:r>
-              <w:t>Visual instruction · demonstration · lab</w:t>
-            </w:r>
-          </w:p>
-        </w:tc>
-        <w:tc>
-          <w:tcPr>
-            <w:tcW w:type="dxa" w:w="1999"/>
-          </w:tcPr>
-          <w:p>
-            <w:r>
-              <w:t>Slides 64–87</w:t>
-            </w:r>
-          </w:p>
-        </w:tc>
-      </w:tr>
-    </w:tbl>
-    <w:p>
-      <w:pPr>
-        <w:pStyle w:val="Heading2"/>
-      </w:pPr>
-      <w:r>
-        <w:t>Day 2</w:t>
-      </w:r>
-    </w:p>
-    <w:tbl>
-      <w:tblPr>
-        <w:tblStyle w:val="TableGrid"/>
-        <w:tblW w:type="auto" w:w="0"/>
-        <w:tblLook w:firstColumn="1" w:firstRow="1" w:lastColumn="0" w:lastRow="0" w:noHBand="0" w:noVBand="1" w:val="04A0"/>
-      </w:tblPr>
-      <w:tblGrid>
-        <w:gridCol w:w="1999"/>
-        <w:gridCol w:w="1999"/>
-        <w:gridCol w:w="1999"/>
-        <w:gridCol w:w="1999"/>
-        <w:gridCol w:w="1999"/>
-      </w:tblGrid>
-      <w:tr>
-        <w:tc>
-          <w:tcPr>
-            <w:tcW w:type="dxa" w:w="1999"/>
-          </w:tcPr>
-          <w:p>
-            <w:r>
-              <w:t>Time</w:t>
-            </w:r>
-          </w:p>
-        </w:tc>
-        <w:tc>
-          <w:tcPr>
-            <w:tcW w:type="dxa" w:w="1999"/>
-          </w:tcPr>
-          <w:p>
-            <w:r>
-              <w:t>Duration</w:t>
-            </w:r>
-          </w:p>
-        </w:tc>
-        <w:tc>
-          <w:tcPr>
-            <w:tcW w:type="dxa" w:w="1999"/>
-          </w:tcPr>
-          <w:p>
-            <w:r>
-              <w:t>Topic / Lab</w:t>
-            </w:r>
-          </w:p>
-        </w:tc>
-        <w:tc>
-          <w:tcPr>
-            <w:tcW w:type="dxa" w:w="1999"/>
-          </w:tcPr>
-          <w:p>
-            <w:r>
-              <w:t>Method</w:t>
-            </w:r>
-          </w:p>
-        </w:tc>
-        <w:tc>
-          <w:tcPr>
-            <w:tcW w:type="dxa" w:w="1999"/>
-          </w:tcPr>
-          <w:p>
-            <w:r>
-              <w:t>Slides</w:t>
-            </w:r>
-          </w:p>
-        </w:tc>
-      </w:tr>
-      <w:tr>
-        <w:tc>
-          <w:tcPr>
-            <w:tcW w:type="dxa" w:w="1999"/>
-          </w:tcPr>
-          <w:p>
-            <w:r>
-              <w:t>9:30 AM–11:00 AM</w:t>
-            </w:r>
-          </w:p>
-        </w:tc>
-        <w:tc>
-          <w:tcPr>
-            <w:tcW w:type="dxa" w:w="1999"/>
-          </w:tcPr>
-          <w:p>
-            <w:r>
-              <w:t>90 min</w:t>
-            </w:r>
-          </w:p>
-        </w:tc>
-        <w:tc>
-          <w:tcPr>
-            <w:tcW w:type="dxa" w:w="1999"/>
-          </w:tcPr>
-          <w:p>
-            <w:r>
-              <w:t>Topic 3 — SEO content and social distribution</w:t>
-            </w:r>
-          </w:p>
-        </w:tc>
-        <w:tc>
-          <w:tcPr>
-            <w:tcW w:type="dxa" w:w="1999"/>
-          </w:tcPr>
-          <w:p>
-            <w:r>
-              <w:t>Visual instruction · demonstration · lab</w:t>
-            </w:r>
-          </w:p>
-        </w:tc>
-        <w:tc>
-          <w:tcPr>
-            <w:tcW w:type="dxa" w:w="1999"/>
-          </w:tcPr>
-          <w:p>
-            <w:r>
-              <w:t>Slides 64–87</w:t>
-            </w:r>
-          </w:p>
-        </w:tc>
-      </w:tr>
-      <w:tr>
-        <w:tc>
-          <w:tcPr>
-            <w:tcW w:type="dxa" w:w="1999"/>
-          </w:tcPr>
-          <w:p>
-            <w:r>
-              <w:t>11:00 AM–11:10 AM</w:t>
-            </w:r>
-          </w:p>
-        </w:tc>
-        <w:tc>
-          <w:tcPr>
-            <w:tcW w:type="dxa" w:w="1999"/>
-          </w:tcPr>
-          <w:p>
-            <w:r>
-              <w:t>10 min</w:t>
-            </w:r>
-          </w:p>
-        </w:tc>
-        <w:tc>
-          <w:tcPr>
-            <w:tcW w:type="dxa" w:w="1999"/>
-          </w:tcPr>
-          <w:p>
-            <w:r>
-              <w:t>Break</w:t>
-            </w:r>
-          </w:p>
-        </w:tc>
-        <w:tc>
-          <w:tcPr>
-            <w:tcW w:type="dxa" w:w="1999"/>
-          </w:tcPr>
-          <w:p>
-            <w:r>
-              <w:t>Break</w:t>
-            </w:r>
-          </w:p>
-        </w:tc>
-        <w:tc>
-          <w:tcPr>
-            <w:tcW w:type="dxa" w:w="1999"/>
-          </w:tcPr>
-          <w:p>
-            <w:r>
-              <w:t>—</w:t>
-            </w:r>
-          </w:p>
-        </w:tc>
-      </w:tr>
-      <w:tr>
-        <w:tc>
-          <w:tcPr>
-            <w:tcW w:type="dxa" w:w="1999"/>
-          </w:tcPr>
-          <w:p>
-            <w:r>
-              <w:t>11:10 AM–12:30 PM</w:t>
-            </w:r>
-          </w:p>
-        </w:tc>
-        <w:tc>
-          <w:tcPr>
-            <w:tcW w:type="dxa" w:w="1999"/>
-          </w:tcPr>
-          <w:p>
-            <w:r>
-              <w:t>80 min</w:t>
-            </w:r>
-          </w:p>
-        </w:tc>
-        <w:tc>
-          <w:tcPr>
-            <w:tcW w:type="dxa" w:w="1999"/>
-          </w:tcPr>
-          <w:p>
-            <w:r>
-              <w:t>Labs 5–6 — blog, image, video and LinkedIn assets</w:t>
-            </w:r>
-          </w:p>
-        </w:tc>
-        <w:tc>
-          <w:tcPr>
-            <w:tcW w:type="dxa" w:w="1999"/>
-          </w:tcPr>
-          <w:p>
-            <w:r>
-              <w:t>Visual instruction · demonstration · lab</w:t>
-            </w:r>
-          </w:p>
-        </w:tc>
-        <w:tc>
-          <w:tcPr>
-            <w:tcW w:type="dxa" w:w="1999"/>
-          </w:tcPr>
-          <w:p>
-            <w:r>
-              <w:t>L5: 79, L6: 83</w:t>
-            </w:r>
-          </w:p>
-        </w:tc>
-      </w:tr>
-      <w:tr>
-        <w:tc>
-          <w:tcPr>
-            <w:tcW w:type="dxa" w:w="1999"/>
-          </w:tcPr>
-          <w:p>
-            <w:r>
-              <w:t>12:30 PM–1:30 PM</w:t>
+              <w:t>4:10 PM–5:10 PM</w:t>
             </w:r>
           </w:p>
         </w:tc>
@@ -1635,267 +1333,7 @@
           </w:tcPr>
           <w:p>
             <w:r>
-              <w:t>Lunch</w:t>
-            </w:r>
-          </w:p>
-        </w:tc>
-        <w:tc>
-          <w:tcPr>
-            <w:tcW w:type="dxa" w:w="1999"/>
-          </w:tcPr>
-          <w:p>
-            <w:r>
-              <w:t>Lunch</w:t>
-            </w:r>
-          </w:p>
-        </w:tc>
-        <w:tc>
-          <w:tcPr>
-            <w:tcW w:type="dxa" w:w="1999"/>
-          </w:tcPr>
-          <w:p>
-            <w:r>
-              <w:t>—</w:t>
-            </w:r>
-          </w:p>
-        </w:tc>
-      </w:tr>
-      <w:tr>
-        <w:tc>
-          <w:tcPr>
-            <w:tcW w:type="dxa" w:w="1999"/>
-          </w:tcPr>
-          <w:p>
-            <w:r>
-              <w:t>1:30 PM–2:50 PM</w:t>
-            </w:r>
-          </w:p>
-        </w:tc>
-        <w:tc>
-          <w:tcPr>
-            <w:tcW w:type="dxa" w:w="1999"/>
-          </w:tcPr>
-          <w:p>
-            <w:r>
-              <w:t>80 min</w:t>
-            </w:r>
-          </w:p>
-        </w:tc>
-        <w:tc>
-          <w:tcPr>
-            <w:tcW w:type="dxa" w:w="1999"/>
-          </w:tcPr>
-          <w:p>
-            <w:r>
-              <w:t>Topic 4 — On-page SEO and Google AI Overviews</w:t>
-            </w:r>
-          </w:p>
-        </w:tc>
-        <w:tc>
-          <w:tcPr>
-            <w:tcW w:type="dxa" w:w="1999"/>
-          </w:tcPr>
-          <w:p>
-            <w:r>
-              <w:t>Visual instruction · demonstration · lab</w:t>
-            </w:r>
-          </w:p>
-        </w:tc>
-        <w:tc>
-          <w:tcPr>
-            <w:tcW w:type="dxa" w:w="1999"/>
-          </w:tcPr>
-          <w:p>
-            <w:r>
-              <w:t>Slides 88–111</w:t>
-            </w:r>
-          </w:p>
-        </w:tc>
-      </w:tr>
-      <w:tr>
-        <w:tc>
-          <w:tcPr>
-            <w:tcW w:type="dxa" w:w="1999"/>
-          </w:tcPr>
-          <w:p>
-            <w:r>
-              <w:t>2:50 PM–3:00 PM</w:t>
-            </w:r>
-          </w:p>
-        </w:tc>
-        <w:tc>
-          <w:tcPr>
-            <w:tcW w:type="dxa" w:w="1999"/>
-          </w:tcPr>
-          <w:p>
-            <w:r>
-              <w:t>10 min</w:t>
-            </w:r>
-          </w:p>
-        </w:tc>
-        <w:tc>
-          <w:tcPr>
-            <w:tcW w:type="dxa" w:w="1999"/>
-          </w:tcPr>
-          <w:p>
-            <w:r>
-              <w:t>Break</w:t>
-            </w:r>
-          </w:p>
-        </w:tc>
-        <w:tc>
-          <w:tcPr>
-            <w:tcW w:type="dxa" w:w="1999"/>
-          </w:tcPr>
-          <w:p>
-            <w:r>
-              <w:t>Break</w:t>
-            </w:r>
-          </w:p>
-        </w:tc>
-        <w:tc>
-          <w:tcPr>
-            <w:tcW w:type="dxa" w:w="1999"/>
-          </w:tcPr>
-          <w:p>
-            <w:r>
-              <w:t>—</w:t>
-            </w:r>
-          </w:p>
-        </w:tc>
-      </w:tr>
-      <w:tr>
-        <w:tc>
-          <w:tcPr>
-            <w:tcW w:type="dxa" w:w="1999"/>
-          </w:tcPr>
-          <w:p>
-            <w:r>
-              <w:t>3:00 PM–4:15 PM</w:t>
-            </w:r>
-          </w:p>
-        </w:tc>
-        <w:tc>
-          <w:tcPr>
-            <w:tcW w:type="dxa" w:w="1999"/>
-          </w:tcPr>
-          <w:p>
-            <w:r>
-              <w:t>75 min</w:t>
-            </w:r>
-          </w:p>
-        </w:tc>
-        <w:tc>
-          <w:tcPr>
-            <w:tcW w:type="dxa" w:w="1999"/>
-          </w:tcPr>
-          <w:p>
-            <w:r>
-              <w:t>Labs 7–8 — metadata, schema and AI Overview page</w:t>
-            </w:r>
-          </w:p>
-        </w:tc>
-        <w:tc>
-          <w:tcPr>
-            <w:tcW w:type="dxa" w:w="1999"/>
-          </w:tcPr>
-          <w:p>
-            <w:r>
-              <w:t>Visual instruction · demonstration · lab</w:t>
-            </w:r>
-          </w:p>
-        </w:tc>
-        <w:tc>
-          <w:tcPr>
-            <w:tcW w:type="dxa" w:w="1999"/>
-          </w:tcPr>
-          <w:p>
-            <w:r>
-              <w:t>L7: 103, L8: 107</w:t>
-            </w:r>
-          </w:p>
-        </w:tc>
-      </w:tr>
-      <w:tr>
-        <w:tc>
-          <w:tcPr>
-            <w:tcW w:type="dxa" w:w="1999"/>
-          </w:tcPr>
-          <w:p>
-            <w:r>
-              <w:t>4:15 PM–4:25 PM</w:t>
-            </w:r>
-          </w:p>
-        </w:tc>
-        <w:tc>
-          <w:tcPr>
-            <w:tcW w:type="dxa" w:w="1999"/>
-          </w:tcPr>
-          <w:p>
-            <w:r>
-              <w:t>10 min</w:t>
-            </w:r>
-          </w:p>
-        </w:tc>
-        <w:tc>
-          <w:tcPr>
-            <w:tcW w:type="dxa" w:w="1999"/>
-          </w:tcPr>
-          <w:p>
-            <w:r>
-              <w:t>Break</w:t>
-            </w:r>
-          </w:p>
-        </w:tc>
-        <w:tc>
-          <w:tcPr>
-            <w:tcW w:type="dxa" w:w="1999"/>
-          </w:tcPr>
-          <w:p>
-            <w:r>
-              <w:t>Break</w:t>
-            </w:r>
-          </w:p>
-        </w:tc>
-        <w:tc>
-          <w:tcPr>
-            <w:tcW w:type="dxa" w:w="1999"/>
-          </w:tcPr>
-          <w:p>
-            <w:r>
-              <w:t>—</w:t>
-            </w:r>
-          </w:p>
-        </w:tc>
-      </w:tr>
-      <w:tr>
-        <w:tc>
-          <w:tcPr>
-            <w:tcW w:type="dxa" w:w="1999"/>
-          </w:tcPr>
-          <w:p>
-            <w:r>
-              <w:t>4:25 PM–5:10 PM</w:t>
-            </w:r>
-          </w:p>
-        </w:tc>
-        <w:tc>
-          <w:tcPr>
-            <w:tcW w:type="dxa" w:w="1999"/>
-          </w:tcPr>
-          <w:p>
-            <w:r>
-              <w:t>45 min</w:t>
-            </w:r>
-          </w:p>
-        </w:tc>
-        <w:tc>
-          <w:tcPr>
-            <w:tcW w:type="dxa" w:w="1999"/>
-          </w:tcPr>
-          <w:p>
-            <w:r>
-              <w:t>Topic 5 — SEO performance, ethics and continuous improvement</w:t>
+              <w:t>Topic 5 — Performance, ethics and continuous improvement + Lab 9</w:t>
             </w:r>
           </w:p>
         </w:tc>

</xml_diff>